<commit_message>
aggiustamenti vari 27.04.2026 ore 19.43
</commit_message>
<xml_diff>
--- a/your-extensions/widgets/gii-azioni/rapporto-template.docx
+++ b/your-extensions/widgets/gii-azioni/rapporto-template.docx
@@ -196,9 +196,18 @@
                 <w:sz w:val="20"/>
                 <w:szCs w:val="20"/>
               </w:rPr>
-              <w:t>N: {{</w:t>
-            </w:r>
-            <w:proofErr w:type="spellStart"/>
+              <w:t>N: {{cod_pratica}} -  ANNO: {{anno}}</w:t>
+            </w:r>
+          </w:p>
+          <w:p>
+            <w:pPr>
+              <w:spacing w:after="120"/>
+              <w:jc w:val="center"/>
+              <w:rPr>
+                <w:sz w:val="20"/>
+                <w:szCs w:val="20"/>
+              </w:rPr>
+            </w:pPr>
             <w:r>
               <w:rPr>
                 <w:rFonts w:ascii="Calibri" w:eastAsia="Calibri" w:hAnsi="Calibri" w:cs="Calibri"/>
@@ -208,10 +217,12 @@
                 <w:sz w:val="20"/>
                 <w:szCs w:val="20"/>
               </w:rPr>
-              <w:t>cod_pratica</w:t>
-            </w:r>
-            <w:proofErr w:type="spellEnd"/>
-            <w:r>
+              <w:t>AREA {{area_label}}</w:t>
+            </w:r>
+          </w:p>
+          <w:p>
+            <w:pPr>
+              <w:jc w:val="center"/>
               <w:rPr>
                 <w:rFonts w:ascii="Calibri" w:eastAsia="Calibri" w:hAnsi="Calibri" w:cs="Calibri"/>
                 <w:b/>
@@ -220,9 +231,7 @@
                 <w:sz w:val="20"/>
                 <w:szCs w:val="20"/>
               </w:rPr>
-              <w:t xml:space="preserve">}} </w:t>
-            </w:r>
-            <w:proofErr w:type="gramStart"/>
+            </w:pPr>
             <w:r>
               <w:rPr>
                 <w:rFonts w:ascii="Calibri" w:eastAsia="Calibri" w:hAnsi="Calibri" w:cs="Calibri"/>
@@ -232,112 +241,7 @@
                 <w:sz w:val="20"/>
                 <w:szCs w:val="20"/>
               </w:rPr>
-              <w:t>-  ANNO</w:t>
-            </w:r>
-            <w:proofErr w:type="gramEnd"/>
-            <w:r>
-              <w:rPr>
-                <w:rFonts w:ascii="Calibri" w:eastAsia="Calibri" w:hAnsi="Calibri" w:cs="Calibri"/>
-                <w:b/>
-                <w:bCs/>
-                <w:color w:val="005B8C"/>
-                <w:sz w:val="20"/>
-                <w:szCs w:val="20"/>
-              </w:rPr>
-              <w:t>: {{anno}}</w:t>
-            </w:r>
-          </w:p>
-          <w:p>
-            <w:pPr>
-              <w:spacing w:after="120"/>
-              <w:jc w:val="center"/>
-              <w:rPr>
-                <w:sz w:val="20"/>
-                <w:szCs w:val="20"/>
-              </w:rPr>
-            </w:pPr>
-            <w:r>
-              <w:rPr>
-                <w:rFonts w:ascii="Calibri" w:eastAsia="Calibri" w:hAnsi="Calibri" w:cs="Calibri"/>
-                <w:b/>
-                <w:bCs/>
-                <w:color w:val="005B8C"/>
-                <w:sz w:val="20"/>
-                <w:szCs w:val="20"/>
-              </w:rPr>
-              <w:t>AREA {{</w:t>
-            </w:r>
-            <w:proofErr w:type="spellStart"/>
-            <w:r>
-              <w:rPr>
-                <w:rFonts w:ascii="Calibri" w:eastAsia="Calibri" w:hAnsi="Calibri" w:cs="Calibri"/>
-                <w:b/>
-                <w:bCs/>
-                <w:color w:val="005B8C"/>
-                <w:sz w:val="20"/>
-                <w:szCs w:val="20"/>
-              </w:rPr>
-              <w:t>area_label</w:t>
-            </w:r>
-            <w:proofErr w:type="spellEnd"/>
-            <w:r>
-              <w:rPr>
-                <w:rFonts w:ascii="Calibri" w:eastAsia="Calibri" w:hAnsi="Calibri" w:cs="Calibri"/>
-                <w:b/>
-                <w:bCs/>
-                <w:color w:val="005B8C"/>
-                <w:sz w:val="20"/>
-                <w:szCs w:val="20"/>
-              </w:rPr>
-              <w:t>}}</w:t>
-            </w:r>
-          </w:p>
-          <w:p>
-            <w:pPr>
-              <w:jc w:val="center"/>
-              <w:rPr>
-                <w:rFonts w:ascii="Calibri" w:eastAsia="Calibri" w:hAnsi="Calibri" w:cs="Calibri"/>
-                <w:b/>
-                <w:bCs/>
-                <w:color w:val="005B8C"/>
-                <w:sz w:val="20"/>
-                <w:szCs w:val="20"/>
-              </w:rPr>
-            </w:pPr>
-            <w:r>
-              <w:rPr>
-                <w:rFonts w:ascii="Calibri" w:eastAsia="Calibri" w:hAnsi="Calibri" w:cs="Calibri"/>
-                <w:b/>
-                <w:bCs/>
-                <w:color w:val="005B8C"/>
-                <w:sz w:val="20"/>
-                <w:szCs w:val="20"/>
-              </w:rPr>
-              <w:t>SETTORE {{</w:t>
-            </w:r>
-            <w:proofErr w:type="spellStart"/>
-            <w:r>
-              <w:rPr>
-                <w:rFonts w:ascii="Calibri" w:eastAsia="Calibri" w:hAnsi="Calibri" w:cs="Calibri"/>
-                <w:b/>
-                <w:bCs/>
-                <w:color w:val="005B8C"/>
-                <w:sz w:val="20"/>
-                <w:szCs w:val="20"/>
-              </w:rPr>
-              <w:t>settore_label</w:t>
-            </w:r>
-            <w:proofErr w:type="spellEnd"/>
-            <w:r>
-              <w:rPr>
-                <w:rFonts w:ascii="Calibri" w:eastAsia="Calibri" w:hAnsi="Calibri" w:cs="Calibri"/>
-                <w:b/>
-                <w:bCs/>
-                <w:color w:val="005B8C"/>
-                <w:sz w:val="20"/>
-                <w:szCs w:val="20"/>
-              </w:rPr>
-              <w:t>}}</w:t>
+              <w:t>SETTORE {{settore_label}}</w:t>
             </w:r>
           </w:p>
         </w:tc>
@@ -357,7 +261,7 @@
               <w:bottom w:val="single" w:sz="4" w:space="0" w:color="ADADAD" w:themeColor="background2" w:themeShade="BF"/>
               <w:right w:val="single" w:sz="4" w:space="0" w:color="ADADAD" w:themeColor="background2" w:themeShade="BF"/>
             </w:tcBorders>
-            <w:shd w:val="clear" w:color="auto" w:fill="D5E8F0"/>
+            <w:shd w:val="clear" w:color="auto" w:fill="DAEAF5"/>
             <w:noWrap/>
             <w:tcMar>
               <w:top w:w="80" w:type="dxa"/>
@@ -419,27 +323,7 @@
                 <w:sz w:val="20"/>
                 <w:szCs w:val="20"/>
               </w:rPr>
-              <w:t>{{</w:t>
-            </w:r>
-            <w:proofErr w:type="spellStart"/>
-            <w:r>
-              <w:rPr>
-                <w:rFonts w:eastAsia="Calibri"/>
-                <w:color w:val="005B8C"/>
-                <w:sz w:val="20"/>
-                <w:szCs w:val="20"/>
-              </w:rPr>
-              <w:t>tecnico_rilevatore</w:t>
-            </w:r>
-            <w:proofErr w:type="spellEnd"/>
-            <w:r>
-              <w:rPr>
-                <w:rFonts w:eastAsia="Calibri"/>
-                <w:color w:val="005B8C"/>
-                <w:sz w:val="20"/>
-                <w:szCs w:val="20"/>
-              </w:rPr>
-              <w:t>}}</w:t>
+              <w:t>{{tecnico_rilevatore}}</w:t>
             </w:r>
           </w:p>
         </w:tc>
@@ -453,7 +337,7 @@
               <w:bottom w:val="single" w:sz="4" w:space="0" w:color="ADADAD" w:themeColor="background2" w:themeShade="BF"/>
               <w:right w:val="single" w:sz="4" w:space="0" w:color="ADADAD" w:themeColor="background2" w:themeShade="BF"/>
             </w:tcBorders>
-            <w:shd w:val="clear" w:color="auto" w:fill="D5E8F0"/>
+            <w:shd w:val="clear" w:color="auto" w:fill="DAEAF5"/>
             <w:vAlign w:val="center"/>
             <w:hideMark/>
           </w:tcPr>
@@ -510,25 +394,7 @@
                 <w:sz w:val="20"/>
                 <w:szCs w:val="20"/>
               </w:rPr>
-              <w:t>{{</w:t>
-            </w:r>
-            <w:proofErr w:type="spellStart"/>
-            <w:r>
-              <w:rPr>
-                <w:color w:val="005B8C"/>
-                <w:sz w:val="20"/>
-                <w:szCs w:val="20"/>
-              </w:rPr>
-              <w:t>data_rilevazione</w:t>
-            </w:r>
-            <w:proofErr w:type="spellEnd"/>
-            <w:r>
-              <w:rPr>
-                <w:color w:val="005B8C"/>
-                <w:sz w:val="20"/>
-                <w:szCs w:val="20"/>
-              </w:rPr>
-              <w:t>}}</w:t>
+              <w:t>{{data_rilevazione}}</w:t>
             </w:r>
           </w:p>
         </w:tc>
@@ -542,7 +408,7 @@
               <w:bottom w:val="single" w:sz="4" w:space="0" w:color="ADADAD" w:themeColor="background2" w:themeShade="BF"/>
               <w:right w:val="single" w:sz="4" w:space="0" w:color="ADADAD" w:themeColor="background2" w:themeShade="BF"/>
             </w:tcBorders>
-            <w:shd w:val="clear" w:color="auto" w:fill="D5E8F0"/>
+            <w:shd w:val="clear" w:color="auto" w:fill="DAEAF5"/>
             <w:vAlign w:val="center"/>
             <w:hideMark/>
           </w:tcPr>
@@ -599,25 +465,7 @@
                 <w:sz w:val="20"/>
                 <w:szCs w:val="20"/>
               </w:rPr>
-              <w:t>{{</w:t>
-            </w:r>
-            <w:proofErr w:type="spellStart"/>
-            <w:r>
-              <w:rPr>
-                <w:color w:val="005B8C"/>
-                <w:sz w:val="20"/>
-                <w:szCs w:val="20"/>
-              </w:rPr>
-              <w:t>ora_rilevazione</w:t>
-            </w:r>
-            <w:proofErr w:type="spellEnd"/>
-            <w:r>
-              <w:rPr>
-                <w:color w:val="005B8C"/>
-                <w:sz w:val="20"/>
-                <w:szCs w:val="20"/>
-              </w:rPr>
-              <w:t>}}</w:t>
+              <w:t>{{ora_rilevazione}}</w:t>
             </w:r>
           </w:p>
         </w:tc>
@@ -703,7 +551,7 @@
                 <w:rFonts w:ascii="Calibri" w:eastAsia="Calibri" w:hAnsi="Calibri" w:cs="Calibri"/>
                 <w:b/>
                 <w:bCs/>
-                <w:color w:val="EE0000"/>
+                <w:color w:val="FFFFFF"/>
                 <w:sz w:val="20"/>
                 <w:szCs w:val="20"/>
               </w:rPr>
@@ -713,7 +561,7 @@
                 <w:rFonts w:ascii="Calibri" w:eastAsia="Calibri" w:hAnsi="Calibri" w:cs="Calibri"/>
                 <w:b/>
                 <w:bCs/>
-                <w:color w:val="EE0000"/>
+                <w:color w:val="FFFFFF"/>
                 <w:sz w:val="19"/>
                 <w:szCs w:val="19"/>
               </w:rPr>
@@ -875,7 +723,7 @@
               <w:bottom w:val="single" w:sz="4" w:space="0" w:color="ADADAD" w:themeColor="background2" w:themeShade="BF"/>
               <w:right w:val="single" w:sz="4" w:space="0" w:color="ADADAD" w:themeColor="background2" w:themeShade="BF"/>
             </w:tcBorders>
-            <w:shd w:val="clear" w:color="auto" w:fill="D5E8F0"/>
+            <w:shd w:val="clear" w:color="auto" w:fill="DAEAF5"/>
             <w:noWrap/>
             <w:tcMar>
               <w:top w:w="80" w:type="dxa"/>
@@ -920,7 +768,7 @@
               <w:bottom w:val="single" w:sz="4" w:space="0" w:color="ADADAD" w:themeColor="background2" w:themeShade="BF"/>
               <w:right w:val="single" w:sz="4" w:space="0" w:color="ADADAD" w:themeColor="background2" w:themeShade="BF"/>
             </w:tcBorders>
-            <w:shd w:val="clear" w:color="auto" w:fill="D5E8F0"/>
+            <w:shd w:val="clear" w:color="auto" w:fill="DAEAF5"/>
             <w:vAlign w:val="center"/>
             <w:hideMark/>
           </w:tcPr>
@@ -958,7 +806,7 @@
               <w:bottom w:val="single" w:sz="4" w:space="0" w:color="ADADAD" w:themeColor="background2" w:themeShade="BF"/>
               <w:right w:val="single" w:sz="4" w:space="0" w:color="ADADAD" w:themeColor="background2" w:themeShade="BF"/>
             </w:tcBorders>
-            <w:shd w:val="clear" w:color="auto" w:fill="D5E8F0"/>
+            <w:shd w:val="clear" w:color="auto" w:fill="DAEAF5"/>
             <w:vAlign w:val="center"/>
             <w:hideMark/>
           </w:tcPr>
@@ -996,7 +844,7 @@
               <w:bottom w:val="single" w:sz="4" w:space="0" w:color="ADADAD" w:themeColor="background2" w:themeShade="BF"/>
               <w:right w:val="single" w:sz="4" w:space="0" w:color="ADADAD" w:themeColor="background2" w:themeShade="BF"/>
             </w:tcBorders>
-            <w:shd w:val="clear" w:color="auto" w:fill="D5E8F0"/>
+            <w:shd w:val="clear" w:color="auto" w:fill="DAEAF5"/>
             <w:vAlign w:val="center"/>
             <w:hideMark/>
           </w:tcPr>
@@ -1034,7 +882,7 @@
               <w:bottom w:val="single" w:sz="4" w:space="0" w:color="ADADAD" w:themeColor="background2" w:themeShade="BF"/>
               <w:right w:val="single" w:sz="4" w:space="0" w:color="ADADAD" w:themeColor="background2" w:themeShade="BF"/>
             </w:tcBorders>
-            <w:shd w:val="clear" w:color="auto" w:fill="D5E8F0"/>
+            <w:shd w:val="clear" w:color="auto" w:fill="DAEAF5"/>
             <w:vAlign w:val="center"/>
             <w:hideMark/>
           </w:tcPr>
@@ -1072,7 +920,7 @@
               <w:bottom w:val="single" w:sz="4" w:space="0" w:color="ADADAD" w:themeColor="background2" w:themeShade="BF"/>
               <w:right w:val="single" w:sz="4" w:space="0" w:color="ADADAD" w:themeColor="background2" w:themeShade="BF"/>
             </w:tcBorders>
-            <w:shd w:val="clear" w:color="auto" w:fill="D5E8F0"/>
+            <w:shd w:val="clear" w:color="auto" w:fill="DAEAF5"/>
             <w:vAlign w:val="center"/>
             <w:hideMark/>
           </w:tcPr>
@@ -1109,7 +957,7 @@
               <w:bottom w:val="single" w:sz="4" w:space="0" w:color="ADADAD" w:themeColor="background2" w:themeShade="BF"/>
               <w:right w:val="single" w:sz="4" w:space="0" w:color="ADADAD" w:themeColor="background2" w:themeShade="BF"/>
             </w:tcBorders>
-            <w:shd w:val="clear" w:color="auto" w:fill="D5E8F0"/>
+            <w:shd w:val="clear" w:color="auto" w:fill="DAEAF5"/>
             <w:vAlign w:val="center"/>
           </w:tcPr>
           <w:p>
@@ -5402,7 +5250,7 @@
               <w:bottom w:val="single" w:sz="4" w:space="0" w:color="ADADAD" w:themeColor="background2" w:themeShade="BF"/>
               <w:right w:val="single" w:sz="4" w:space="0" w:color="ADADAD" w:themeColor="background2" w:themeShade="BF"/>
             </w:tcBorders>
-            <w:shd w:val="clear" w:color="auto" w:fill="D5E8F0"/>
+            <w:shd w:val="clear" w:color="auto" w:fill="DAEAF5"/>
             <w:noWrap/>
             <w:tcMar>
               <w:top w:w="80" w:type="dxa"/>
@@ -5476,25 +5324,7 @@
                 <w:sz w:val="20"/>
                 <w:szCs w:val="20"/>
               </w:rPr>
-              <w:t>{{</w:t>
-            </w:r>
-            <w:proofErr w:type="spellStart"/>
-            <w:r>
-              <w:rPr>
-                <w:color w:val="005B8C"/>
-                <w:sz w:val="20"/>
-                <w:szCs w:val="20"/>
-              </w:rPr>
-              <w:t>descrizione_fatti</w:t>
-            </w:r>
-            <w:proofErr w:type="spellEnd"/>
-            <w:r>
-              <w:rPr>
-                <w:color w:val="005B8C"/>
-                <w:sz w:val="20"/>
-                <w:szCs w:val="20"/>
-              </w:rPr>
-              <w:t>}}</w:t>
+              <w:t>{{descrizione_fatti}}</w:t>
             </w:r>
           </w:p>
         </w:tc>
@@ -5514,7 +5344,7 @@
               <w:bottom w:val="single" w:sz="4" w:space="0" w:color="ADADAD" w:themeColor="background2" w:themeShade="BF"/>
               <w:right w:val="single" w:sz="4" w:space="0" w:color="ADADAD" w:themeColor="background2" w:themeShade="BF"/>
             </w:tcBorders>
-            <w:shd w:val="clear" w:color="auto" w:fill="D5E8F0"/>
+            <w:shd w:val="clear" w:color="auto" w:fill="DAEAF5"/>
             <w:noWrap/>
             <w:tcMar>
               <w:top w:w="80" w:type="dxa"/>
@@ -5606,7 +5436,7 @@
               <w:bottom w:val="single" w:sz="4" w:space="0" w:color="ADADAD" w:themeColor="background2" w:themeShade="BF"/>
               <w:right w:val="single" w:sz="4" w:space="0" w:color="ADADAD" w:themeColor="background2" w:themeShade="BF"/>
             </w:tcBorders>
-            <w:shd w:val="clear" w:color="auto" w:fill="D5E8F0"/>
+            <w:shd w:val="clear" w:color="auto" w:fill="DAEAF5"/>
             <w:noWrap/>
             <w:tcMar>
               <w:top w:w="80" w:type="dxa"/>
@@ -5678,25 +5508,7 @@
                 <w:sz w:val="20"/>
                 <w:szCs w:val="20"/>
               </w:rPr>
-              <w:t>{{</w:t>
-            </w:r>
-            <w:proofErr w:type="spellStart"/>
-            <w:r>
-              <w:rPr>
-                <w:color w:val="005B8C"/>
-                <w:sz w:val="20"/>
-                <w:szCs w:val="20"/>
-              </w:rPr>
-              <w:t>descrizione_luogo</w:t>
-            </w:r>
-            <w:proofErr w:type="spellEnd"/>
-            <w:r>
-              <w:rPr>
-                <w:color w:val="005B8C"/>
-                <w:sz w:val="20"/>
-                <w:szCs w:val="20"/>
-              </w:rPr>
-              <w:t>}}</w:t>
+              <w:t>{{descrizione_luogo}}</w:t>
             </w:r>
           </w:p>
         </w:tc>
@@ -5716,7 +5528,7 @@
               <w:bottom w:val="single" w:sz="4" w:space="0" w:color="ADADAD" w:themeColor="background2" w:themeShade="BF"/>
               <w:right w:val="single" w:sz="4" w:space="0" w:color="ADADAD" w:themeColor="background2" w:themeShade="BF"/>
             </w:tcBorders>
-            <w:shd w:val="clear" w:color="auto" w:fill="D5E8F0"/>
+            <w:shd w:val="clear" w:color="auto" w:fill="DAEAF5"/>
             <w:noWrap/>
             <w:tcMar>
               <w:top w:w="80" w:type="dxa"/>
@@ -5902,25 +5714,7 @@
                 <w:sz w:val="20"/>
                 <w:szCs w:val="20"/>
               </w:rPr>
-              <w:t>Matricola contatore: {{</w:t>
-            </w:r>
-            <w:proofErr w:type="spellStart"/>
-            <w:r>
-              <w:rPr>
-                <w:color w:val="005B8C"/>
-                <w:sz w:val="20"/>
-                <w:szCs w:val="20"/>
-              </w:rPr>
-              <w:t>matricola_contatore</w:t>
-            </w:r>
-            <w:proofErr w:type="spellEnd"/>
-            <w:r>
-              <w:rPr>
-                <w:color w:val="005B8C"/>
-                <w:sz w:val="20"/>
-                <w:szCs w:val="20"/>
-              </w:rPr>
-              <w:t>}}</w:t>
+              <w:t>Matricola contatore: {{matricola_contatore}}</w:t>
             </w:r>
           </w:p>
         </w:tc>
@@ -5953,25 +5747,7 @@
                 <w:sz w:val="20"/>
                 <w:szCs w:val="20"/>
               </w:rPr>
-              <w:t>Matricola tessera: {{</w:t>
-            </w:r>
-            <w:proofErr w:type="spellStart"/>
-            <w:r>
-              <w:rPr>
-                <w:color w:val="005B8C"/>
-                <w:sz w:val="20"/>
-                <w:szCs w:val="20"/>
-              </w:rPr>
-              <w:t>matricola_tessera</w:t>
-            </w:r>
-            <w:proofErr w:type="spellEnd"/>
-            <w:r>
-              <w:rPr>
-                <w:color w:val="005B8C"/>
-                <w:sz w:val="20"/>
-                <w:szCs w:val="20"/>
-              </w:rPr>
-              <w:t>}}</w:t>
+              <w:t>Matricola tessera: {{matricola_tessera}}</w:t>
             </w:r>
           </w:p>
         </w:tc>
@@ -6089,7 +5865,7 @@
               <w:bottom w:val="single" w:sz="4" w:space="0" w:color="ADADAD" w:themeColor="background2" w:themeShade="BF"/>
               <w:right w:val="single" w:sz="4" w:space="0" w:color="ADADAD" w:themeColor="background2" w:themeShade="BF"/>
             </w:tcBorders>
-            <w:shd w:val="clear" w:color="auto" w:fill="D5E8F0"/>
+            <w:shd w:val="clear" w:color="auto" w:fill="DAEAF5"/>
             <w:noWrap/>
             <w:tcMar>
               <w:top w:w="80" w:type="dxa"/>
@@ -6164,7 +5940,7 @@
               <w:bottom w:val="single" w:sz="4" w:space="0" w:color="ADADAD" w:themeColor="background2" w:themeShade="BF"/>
               <w:right w:val="single" w:sz="4" w:space="0" w:color="ADADAD" w:themeColor="background2" w:themeShade="BF"/>
             </w:tcBorders>
-            <w:shd w:val="clear" w:color="auto" w:fill="D5E8F0"/>
+            <w:shd w:val="clear" w:color="auto" w:fill="DAEAF5"/>
             <w:noWrap/>
             <w:vAlign w:val="center"/>
           </w:tcPr>
@@ -6219,25 +5995,7 @@
                 <w:sz w:val="20"/>
                 <w:szCs w:val="20"/>
               </w:rPr>
-              <w:t>{{</w:t>
-            </w:r>
-            <w:proofErr w:type="spellStart"/>
-            <w:r>
-              <w:rPr>
-                <w:color w:val="005B8C"/>
-                <w:sz w:val="20"/>
-                <w:szCs w:val="20"/>
-              </w:rPr>
-              <w:t>cf_piva</w:t>
-            </w:r>
-            <w:proofErr w:type="spellEnd"/>
-            <w:r>
-              <w:rPr>
-                <w:color w:val="005B8C"/>
-                <w:sz w:val="20"/>
-                <w:szCs w:val="20"/>
-              </w:rPr>
-              <w:t>}}</w:t>
+              <w:t>{{cf_piva}}</w:t>
             </w:r>
           </w:p>
         </w:tc>
@@ -6305,7 +6063,7 @@
               <w:bottom w:val="single" w:sz="4" w:space="0" w:color="ADADAD" w:themeColor="background2" w:themeShade="BF"/>
               <w:right w:val="single" w:sz="4" w:space="0" w:color="ADADAD" w:themeColor="background2" w:themeShade="BF"/>
             </w:tcBorders>
-            <w:shd w:val="clear" w:color="auto" w:fill="D5E8F0"/>
+            <w:shd w:val="clear" w:color="auto" w:fill="DAEAF5"/>
             <w:noWrap/>
             <w:tcMar>
               <w:top w:w="80" w:type="dxa"/>
@@ -6375,7 +6133,7 @@
               <w:bottom w:val="single" w:sz="4" w:space="0" w:color="ADADAD" w:themeColor="background2" w:themeShade="BF"/>
               <w:right w:val="single" w:sz="4" w:space="0" w:color="ADADAD" w:themeColor="background2" w:themeShade="BF"/>
             </w:tcBorders>
-            <w:shd w:val="clear" w:color="auto" w:fill="D5E8F0"/>
+            <w:shd w:val="clear" w:color="auto" w:fill="DAEAF5"/>
             <w:noWrap/>
             <w:vAlign w:val="center"/>
           </w:tcPr>
@@ -6425,25 +6183,7 @@
                 <w:sz w:val="20"/>
                 <w:szCs w:val="20"/>
               </w:rPr>
-              <w:t>{{</w:t>
-            </w:r>
-            <w:proofErr w:type="gramStart"/>
-            <w:r>
-              <w:rPr>
-                <w:color w:val="005B8C"/>
-                <w:sz w:val="20"/>
-                <w:szCs w:val="20"/>
-              </w:rPr>
-              <w:t>citta</w:t>
-            </w:r>
-            <w:proofErr w:type="gramEnd"/>
-            <w:r>
-              <w:rPr>
-                <w:color w:val="005B8C"/>
-                <w:sz w:val="20"/>
-                <w:szCs w:val="20"/>
-              </w:rPr>
-              <w:t>}}</w:t>
+              <w:t>{{citta}}</w:t>
             </w:r>
           </w:p>
         </w:tc>
@@ -6462,7 +6202,7 @@
               <w:bottom w:val="single" w:sz="4" w:space="0" w:color="ADADAD" w:themeColor="background2" w:themeShade="BF"/>
               <w:right w:val="single" w:sz="4" w:space="0" w:color="ADADAD" w:themeColor="background2" w:themeShade="BF"/>
             </w:tcBorders>
-            <w:shd w:val="clear" w:color="auto" w:fill="D5E8F0"/>
+            <w:shd w:val="clear" w:color="auto" w:fill="DAEAF5"/>
             <w:noWrap/>
             <w:tcMar>
               <w:top w:w="80" w:type="dxa"/>
@@ -6519,25 +6259,7 @@
                 <w:sz w:val="20"/>
                 <w:szCs w:val="20"/>
               </w:rPr>
-              <w:t>{{</w:t>
-            </w:r>
-            <w:proofErr w:type="spellStart"/>
-            <w:r>
-              <w:rPr>
-                <w:color w:val="005B8C"/>
-                <w:sz w:val="20"/>
-                <w:szCs w:val="20"/>
-              </w:rPr>
-              <w:t>localita</w:t>
-            </w:r>
-            <w:proofErr w:type="spellEnd"/>
-            <w:r>
-              <w:rPr>
-                <w:color w:val="005B8C"/>
-                <w:sz w:val="20"/>
-                <w:szCs w:val="20"/>
-              </w:rPr>
-              <w:t>}}</w:t>
+              <w:t>{{localita}}</w:t>
             </w:r>
           </w:p>
         </w:tc>
@@ -6550,7 +6272,7 @@
               <w:bottom w:val="single" w:sz="4" w:space="0" w:color="ADADAD" w:themeColor="background2" w:themeShade="BF"/>
               <w:right w:val="single" w:sz="4" w:space="0" w:color="ADADAD" w:themeColor="background2" w:themeShade="BF"/>
             </w:tcBorders>
-            <w:shd w:val="clear" w:color="auto" w:fill="D5E8F0"/>
+            <w:shd w:val="clear" w:color="auto" w:fill="DAEAF5"/>
             <w:noWrap/>
             <w:vAlign w:val="center"/>
           </w:tcPr>
@@ -6619,7 +6341,7 @@
               <w:bottom w:val="single" w:sz="4" w:space="0" w:color="ADADAD" w:themeColor="background2" w:themeShade="BF"/>
               <w:right w:val="single" w:sz="4" w:space="0" w:color="ADADAD" w:themeColor="background2" w:themeShade="BF"/>
             </w:tcBorders>
-            <w:shd w:val="clear" w:color="auto" w:fill="D5E8F0"/>
+            <w:shd w:val="clear" w:color="auto" w:fill="DAEAF5"/>
             <w:noWrap/>
             <w:tcMar>
               <w:top w:w="80" w:type="dxa"/>
@@ -6689,7 +6411,7 @@
               <w:bottom w:val="single" w:sz="4" w:space="0" w:color="ADADAD" w:themeColor="background2" w:themeShade="BF"/>
               <w:right w:val="single" w:sz="4" w:space="0" w:color="ADADAD" w:themeColor="background2" w:themeShade="BF"/>
             </w:tcBorders>
-            <w:shd w:val="clear" w:color="auto" w:fill="D5E8F0"/>
+            <w:shd w:val="clear" w:color="auto" w:fill="DAEAF5"/>
             <w:noWrap/>
             <w:vAlign w:val="center"/>
           </w:tcPr>
@@ -6739,35 +6461,7 @@
                 <w:sz w:val="20"/>
                 <w:szCs w:val="20"/>
               </w:rPr>
-              <w:t>{{</w:t>
-            </w:r>
-            <w:proofErr w:type="spellStart"/>
-            <w:proofErr w:type="gramStart"/>
-            <w:r>
-              <w:rPr>
-                <w:color w:val="005B8C"/>
-                <w:sz w:val="20"/>
-                <w:szCs w:val="20"/>
-              </w:rPr>
-              <w:t>email</w:t>
-            </w:r>
-            <w:proofErr w:type="gramEnd"/>
-            <w:r>
-              <w:rPr>
-                <w:color w:val="005B8C"/>
-                <w:sz w:val="20"/>
-                <w:szCs w:val="20"/>
-              </w:rPr>
-              <w:t>_pec</w:t>
-            </w:r>
-            <w:proofErr w:type="spellEnd"/>
-            <w:r>
-              <w:rPr>
-                <w:color w:val="005B8C"/>
-                <w:sz w:val="20"/>
-                <w:szCs w:val="20"/>
-              </w:rPr>
-              <w:t>}}</w:t>
+              <w:t>{{email_pec}}</w:t>
             </w:r>
           </w:p>
         </w:tc>
@@ -6779,14 +6473,14 @@
         </w:trPr>
         <w:tc>
           <w:tcPr>
-            <w:tcW w:w="1529" w:type="dxa"/>
-            <w:tcBorders>
-              <w:top w:val="single" w:sz="4" w:space="0" w:color="ADADAD" w:themeColor="background2" w:themeShade="BF"/>
-              <w:left w:val="single" w:sz="4" w:space="0" w:color="ADADAD" w:themeColor="background2" w:themeShade="BF"/>
-              <w:bottom w:val="single" w:sz="4" w:space="0" w:color="ADADAD" w:themeColor="background2" w:themeShade="BF"/>
-              <w:right w:val="single" w:sz="4" w:space="0" w:color="ADADAD" w:themeColor="background2" w:themeShade="BF"/>
-            </w:tcBorders>
-            <w:shd w:val="clear" w:color="auto" w:fill="D5E8F0"/>
+            <w:tcW w:w="2688" w:type="dxa"/>
+            <w:gridSpan w:val="2"/>
+            <w:tcBorders>
+              <w:top w:val="single" w:sz="4" w:space="0" w:color="ADADAD" w:themeColor="background2" w:themeShade="BF"/>
+              <w:left w:val="single" w:sz="4" w:space="0" w:color="ADADAD" w:themeColor="background2" w:themeShade="BF"/>
+              <w:bottom w:val="single" w:sz="4" w:space="0" w:color="ADADAD" w:themeColor="background2" w:themeShade="BF"/>
+              <w:right w:val="single" w:sz="4" w:space="0" w:color="ADADAD" w:themeColor="background2" w:themeShade="BF"/>
+            </w:tcBorders>
             <w:noWrap/>
             <w:tcMar>
               <w:top w:w="80" w:type="dxa"/>
@@ -6807,19 +6501,52 @@
             </w:pPr>
             <w:r>
               <w:rPr>
+                <w:rFonts w:ascii="Calibri" w:eastAsia="Calibri" w:hAnsi="Calibri" w:cs="Calibri"/>
+                <w:b/>
+                <w:bCs/>
+                <w:sz w:val="20"/>
+                <w:szCs w:val="20"/>
+              </w:rPr>
+              <w:t>Il Trasgressore era presente?</w:t>
+            </w:r>
+          </w:p>
+        </w:tc>
+        <w:tc>
+          <w:tcPr>
+            <w:tcW w:w="567" w:type="dxa"/>
+            <w:gridSpan w:val="2"/>
+            <w:tcBorders>
+              <w:top w:val="single" w:sz="4" w:space="0" w:color="ADADAD" w:themeColor="background2" w:themeShade="BF"/>
+              <w:left w:val="single" w:sz="4" w:space="0" w:color="ADADAD" w:themeColor="background2" w:themeShade="BF"/>
+              <w:bottom w:val="single" w:sz="4" w:space="0" w:color="ADADAD" w:themeColor="background2" w:themeShade="BF"/>
+              <w:right w:val="single" w:sz="4" w:space="0" w:color="ADADAD" w:themeColor="background2" w:themeShade="BF"/>
+            </w:tcBorders>
+            <w:noWrap/>
+            <w:vAlign w:val="center"/>
+          </w:tcPr>
+          <w:p>
+            <w:pPr>
+              <w:rPr>
+                <w:color w:val="005B8C"/>
+                <w:sz w:val="20"/>
+                <w:szCs w:val="20"/>
+              </w:rPr>
+            </w:pPr>
+            <w:r>
+              <w:rPr>
                 <w:rFonts w:eastAsia="Calibri"/>
                 <w:color w:val="005B8C"/>
                 <w:sz w:val="20"/>
                 <w:szCs w:val="20"/>
               </w:rPr>
-              <w:t>Via</w:t>
-            </w:r>
-          </w:p>
-        </w:tc>
-        <w:tc>
-          <w:tcPr>
-            <w:tcW w:w="4762" w:type="dxa"/>
-            <w:gridSpan w:val="6"/>
+              <w:t>{{presenza_trasgressore}}</w:t>
+            </w:r>
+          </w:p>
+        </w:tc>
+        <w:tc>
+          <w:tcPr>
+            <w:tcW w:w="4171" w:type="dxa"/>
+            <w:gridSpan w:val="4"/>
             <w:tcBorders>
               <w:top w:val="single" w:sz="4" w:space="0" w:color="ADADAD" w:themeColor="background2" w:themeShade="BF"/>
               <w:left w:val="single" w:sz="4" w:space="0" w:color="ADADAD" w:themeColor="background2" w:themeShade="BF"/>
@@ -6831,113 +6558,58 @@
           </w:tcPr>
           <w:p>
             <w:pPr>
-              <w:rPr>
-                <w:color w:val="005B8C"/>
-                <w:sz w:val="20"/>
-                <w:szCs w:val="20"/>
-              </w:rPr>
-            </w:pPr>
-            <w:r>
-              <w:rPr>
-                <w:color w:val="005B8C"/>
-                <w:sz w:val="20"/>
-                <w:szCs w:val="20"/>
-              </w:rPr>
-              <w:t>{{via}}</w:t>
-            </w:r>
-          </w:p>
-        </w:tc>
-        <w:tc>
-          <w:tcPr>
-            <w:tcW w:w="1135" w:type="dxa"/>
-            <w:tcBorders>
-              <w:top w:val="single" w:sz="4" w:space="0" w:color="ADADAD" w:themeColor="background2" w:themeShade="BF"/>
-              <w:left w:val="single" w:sz="4" w:space="0" w:color="ADADAD" w:themeColor="background2" w:themeShade="BF"/>
-              <w:bottom w:val="single" w:sz="4" w:space="0" w:color="ADADAD" w:themeColor="background2" w:themeShade="BF"/>
-              <w:right w:val="single" w:sz="4" w:space="0" w:color="ADADAD" w:themeColor="background2" w:themeShade="BF"/>
-            </w:tcBorders>
-            <w:shd w:val="clear" w:color="auto" w:fill="D5E8F0"/>
+              <w:jc w:val="right"/>
+              <w:rPr>
+                <w:rFonts w:eastAsia="Calibri"/>
+                <w:color w:val="005B8C"/>
+                <w:sz w:val="20"/>
+                <w:szCs w:val="20"/>
+              </w:rPr>
+            </w:pPr>
+            <w:r>
+              <w:rPr>
+                <w:rFonts w:ascii="Calibri" w:eastAsia="Calibri" w:hAnsi="Calibri" w:cs="Calibri"/>
+                <w:b/>
+                <w:bCs/>
+                <w:sz w:val="20"/>
+                <w:szCs w:val="20"/>
+              </w:rPr>
+              <w:t>Firma del trasgressore</w:t>
+            </w:r>
+          </w:p>
+        </w:tc>
+        <w:tc>
+          <w:tcPr>
+            <w:tcW w:w="1984" w:type="dxa"/>
+            <w:tcBorders>
+              <w:top w:val="single" w:sz="4" w:space="0" w:color="ADADAD" w:themeColor="background2" w:themeShade="BF"/>
+              <w:left w:val="single" w:sz="4" w:space="0" w:color="ADADAD" w:themeColor="background2" w:themeShade="BF"/>
+              <w:bottom w:val="single" w:sz="4" w:space="0" w:color="ADADAD" w:themeColor="background2" w:themeShade="BF"/>
+              <w:right w:val="single" w:sz="4" w:space="0" w:color="ADADAD" w:themeColor="background2" w:themeShade="BF"/>
+            </w:tcBorders>
             <w:noWrap/>
             <w:vAlign w:val="center"/>
           </w:tcPr>
           <w:p>
             <w:pPr>
               <w:rPr>
-                <w:rFonts w:eastAsia="Calibri"/>
-                <w:color w:val="005B8C"/>
-                <w:sz w:val="20"/>
-                <w:szCs w:val="20"/>
-              </w:rPr>
-            </w:pPr>
-            <w:r>
-              <w:rPr>
-                <w:rFonts w:eastAsia="Calibri"/>
-                <w:color w:val="005B8C"/>
-                <w:sz w:val="20"/>
-                <w:szCs w:val="20"/>
-              </w:rPr>
-              <w:t>n.</w:t>
-            </w:r>
-          </w:p>
-        </w:tc>
-        <w:tc>
-          <w:tcPr>
-            <w:tcW w:w="1984" w:type="dxa"/>
-            <w:tcBorders>
-              <w:top w:val="single" w:sz="4" w:space="0" w:color="ADADAD" w:themeColor="background2" w:themeShade="BF"/>
-              <w:left w:val="single" w:sz="4" w:space="0" w:color="ADADAD" w:themeColor="background2" w:themeShade="BF"/>
-              <w:bottom w:val="single" w:sz="4" w:space="0" w:color="ADADAD" w:themeColor="background2" w:themeShade="BF"/>
-              <w:right w:val="single" w:sz="4" w:space="0" w:color="ADADAD" w:themeColor="background2" w:themeShade="BF"/>
-            </w:tcBorders>
-            <w:noWrap/>
-            <w:vAlign w:val="center"/>
-          </w:tcPr>
-          <w:p>
-            <w:pPr>
-              <w:rPr>
-                <w:color w:val="005B8C"/>
-                <w:sz w:val="20"/>
-                <w:szCs w:val="20"/>
-              </w:rPr>
-            </w:pPr>
-            <w:r>
-              <w:rPr>
-                <w:color w:val="005B8C"/>
-                <w:sz w:val="20"/>
-                <w:szCs w:val="20"/>
-              </w:rPr>
-              <w:t>{{</w:t>
-            </w:r>
-            <w:proofErr w:type="gramStart"/>
-            <w:r>
-              <w:rPr>
-                <w:color w:val="005B8C"/>
-                <w:sz w:val="20"/>
-                <w:szCs w:val="20"/>
-              </w:rPr>
-              <w:t>citta</w:t>
-            </w:r>
-            <w:proofErr w:type="gramEnd"/>
-            <w:r>
-              <w:rPr>
-                <w:color w:val="005B8C"/>
-                <w:sz w:val="20"/>
-                <w:szCs w:val="20"/>
-              </w:rPr>
-              <w:t>}}</w:t>
-            </w:r>
+                <w:color w:val="005B8C"/>
+                <w:sz w:val="20"/>
+                <w:szCs w:val="20"/>
+              </w:rPr>
+            </w:pPr>
           </w:p>
         </w:tc>
       </w:tr>
       <w:tr>
         <w:trPr>
-          <w:trHeight w:hRule="exact" w:val="340"/>
+          <w:trHeight w:hRule="exact" w:val="567"/>
           <w:jc w:val="center"/>
         </w:trPr>
         <w:tc>
           <w:tcPr>
-            <w:tcW w:w="2688" w:type="dxa"/>
-            <w:gridSpan w:val="2"/>
+            <w:tcW w:w="9410" w:type="dxa"/>
+            <w:gridSpan w:val="9"/>
             <w:tcBorders>
               <w:top w:val="single" w:sz="4" w:space="0" w:color="ADADAD" w:themeColor="background2" w:themeShade="BF"/>
               <w:left w:val="single" w:sz="4" w:space="0" w:color="ADADAD" w:themeColor="background2" w:themeShade="BF"/>
@@ -6955,95 +6627,11 @@
           </w:tcPr>
           <w:p>
             <w:pPr>
-              <w:rPr>
-                <w:rFonts w:eastAsia="Calibri"/>
-                <w:color w:val="005B8C"/>
-                <w:sz w:val="20"/>
-                <w:szCs w:val="20"/>
-              </w:rPr>
-            </w:pPr>
-            <w:r>
+              <w:jc w:val="center"/>
               <w:rPr>
                 <w:rFonts w:ascii="Calibri" w:eastAsia="Calibri" w:hAnsi="Calibri" w:cs="Calibri"/>
                 <w:b/>
                 <w:bCs/>
-                <w:sz w:val="20"/>
-                <w:szCs w:val="20"/>
-              </w:rPr>
-              <w:t>Il Trasgressore era presente?</w:t>
-            </w:r>
-          </w:p>
-        </w:tc>
-        <w:tc>
-          <w:tcPr>
-            <w:tcW w:w="567" w:type="dxa"/>
-            <w:gridSpan w:val="2"/>
-            <w:tcBorders>
-              <w:top w:val="single" w:sz="4" w:space="0" w:color="ADADAD" w:themeColor="background2" w:themeShade="BF"/>
-              <w:left w:val="single" w:sz="4" w:space="0" w:color="ADADAD" w:themeColor="background2" w:themeShade="BF"/>
-              <w:bottom w:val="single" w:sz="4" w:space="0" w:color="ADADAD" w:themeColor="background2" w:themeShade="BF"/>
-              <w:right w:val="single" w:sz="4" w:space="0" w:color="ADADAD" w:themeColor="background2" w:themeShade="BF"/>
-            </w:tcBorders>
-            <w:noWrap/>
-            <w:vAlign w:val="center"/>
-          </w:tcPr>
-          <w:p>
-            <w:pPr>
-              <w:rPr>
-                <w:color w:val="005B8C"/>
-                <w:sz w:val="20"/>
-                <w:szCs w:val="20"/>
-              </w:rPr>
-            </w:pPr>
-            <w:r>
-              <w:rPr>
-                <w:rFonts w:eastAsia="Calibri"/>
-                <w:color w:val="005B8C"/>
-                <w:sz w:val="20"/>
-                <w:szCs w:val="20"/>
-              </w:rPr>
-              <w:t>{{</w:t>
-            </w:r>
-            <w:proofErr w:type="spellStart"/>
-            <w:r>
-              <w:rPr>
-                <w:rFonts w:eastAsia="Calibri"/>
-                <w:color w:val="005B8C"/>
-                <w:sz w:val="20"/>
-                <w:szCs w:val="20"/>
-              </w:rPr>
-              <w:t>presenza_trasgressore</w:t>
-            </w:r>
-            <w:proofErr w:type="spellEnd"/>
-            <w:r>
-              <w:rPr>
-                <w:rFonts w:eastAsia="Calibri"/>
-                <w:color w:val="005B8C"/>
-                <w:sz w:val="20"/>
-                <w:szCs w:val="20"/>
-              </w:rPr>
-              <w:t>}}</w:t>
-            </w:r>
-          </w:p>
-        </w:tc>
-        <w:tc>
-          <w:tcPr>
-            <w:tcW w:w="4171" w:type="dxa"/>
-            <w:gridSpan w:val="4"/>
-            <w:tcBorders>
-              <w:top w:val="single" w:sz="4" w:space="0" w:color="ADADAD" w:themeColor="background2" w:themeShade="BF"/>
-              <w:left w:val="single" w:sz="4" w:space="0" w:color="ADADAD" w:themeColor="background2" w:themeShade="BF"/>
-              <w:bottom w:val="single" w:sz="4" w:space="0" w:color="ADADAD" w:themeColor="background2" w:themeShade="BF"/>
-              <w:right w:val="single" w:sz="4" w:space="0" w:color="ADADAD" w:themeColor="background2" w:themeShade="BF"/>
-            </w:tcBorders>
-            <w:noWrap/>
-            <w:vAlign w:val="center"/>
-          </w:tcPr>
-          <w:p>
-            <w:pPr>
-              <w:jc w:val="right"/>
-              <w:rPr>
-                <w:rFonts w:eastAsia="Calibri"/>
                 <w:color w:val="005B8C"/>
                 <w:sz w:val="20"/>
                 <w:szCs w:val="20"/>
@@ -7054,45 +6642,24 @@
                 <w:rFonts w:ascii="Calibri" w:eastAsia="Calibri" w:hAnsi="Calibri" w:cs="Calibri"/>
                 <w:b/>
                 <w:bCs/>
-                <w:sz w:val="20"/>
-                <w:szCs w:val="20"/>
-              </w:rPr>
-              <w:t>Firma del trasgressore</w:t>
-            </w:r>
-          </w:p>
-        </w:tc>
-        <w:tc>
-          <w:tcPr>
-            <w:tcW w:w="1984" w:type="dxa"/>
-            <w:tcBorders>
-              <w:top w:val="single" w:sz="4" w:space="0" w:color="ADADAD" w:themeColor="background2" w:themeShade="BF"/>
-              <w:left w:val="single" w:sz="4" w:space="0" w:color="ADADAD" w:themeColor="background2" w:themeShade="BF"/>
-              <w:bottom w:val="single" w:sz="4" w:space="0" w:color="ADADAD" w:themeColor="background2" w:themeShade="BF"/>
-              <w:right w:val="single" w:sz="4" w:space="0" w:color="ADADAD" w:themeColor="background2" w:themeShade="BF"/>
-            </w:tcBorders>
-            <w:noWrap/>
-            <w:vAlign w:val="center"/>
-          </w:tcPr>
-          <w:p>
-            <w:pPr>
-              <w:rPr>
-                <w:color w:val="005B8C"/>
-                <w:sz w:val="20"/>
-                <w:szCs w:val="20"/>
-              </w:rPr>
-            </w:pPr>
+                <w:color w:val="005B8C"/>
+                <w:sz w:val="20"/>
+                <w:szCs w:val="20"/>
+              </w:rPr>
+              <w:t>FIRMATO</w:t>
+            </w:r>
           </w:p>
         </w:tc>
       </w:tr>
       <w:tr>
         <w:trPr>
-          <w:trHeight w:hRule="exact" w:val="567"/>
+          <w:trHeight w:hRule="exact" w:val="340"/>
           <w:jc w:val="center"/>
         </w:trPr>
         <w:tc>
           <w:tcPr>
-            <w:tcW w:w="9410" w:type="dxa"/>
-            <w:gridSpan w:val="9"/>
+            <w:tcW w:w="2688" w:type="dxa"/>
+            <w:gridSpan w:val="2"/>
             <w:tcBorders>
               <w:top w:val="single" w:sz="4" w:space="0" w:color="ADADAD" w:themeColor="background2" w:themeShade="BF"/>
               <w:left w:val="single" w:sz="4" w:space="0" w:color="ADADAD" w:themeColor="background2" w:themeShade="BF"/>
@@ -7110,7 +6677,6 @@
           </w:tcPr>
           <w:p>
             <w:pPr>
-              <w:jc w:val="center"/>
               <w:rPr>
                 <w:rFonts w:ascii="Calibri" w:eastAsia="Calibri" w:hAnsi="Calibri" w:cs="Calibri"/>
                 <w:b/>
@@ -7129,7 +6695,41 @@
                 <w:sz w:val="20"/>
                 <w:szCs w:val="20"/>
               </w:rPr>
-              <w:t>FIRMATO</w:t>
+              <w:t>Il Tecnico Rilevatore:</w:t>
+            </w:r>
+          </w:p>
+        </w:tc>
+        <w:tc>
+          <w:tcPr>
+            <w:tcW w:w="6722" w:type="dxa"/>
+            <w:gridSpan w:val="7"/>
+            <w:tcBorders>
+              <w:top w:val="single" w:sz="4" w:space="0" w:color="ADADAD" w:themeColor="background2" w:themeShade="BF"/>
+              <w:left w:val="single" w:sz="4" w:space="0" w:color="ADADAD" w:themeColor="background2" w:themeShade="BF"/>
+              <w:bottom w:val="single" w:sz="4" w:space="0" w:color="ADADAD" w:themeColor="background2" w:themeShade="BF"/>
+              <w:right w:val="single" w:sz="4" w:space="0" w:color="ADADAD" w:themeColor="background2" w:themeShade="BF"/>
+            </w:tcBorders>
+            <w:vAlign w:val="center"/>
+          </w:tcPr>
+          <w:p>
+            <w:pPr>
+              <w:rPr>
+                <w:rFonts w:ascii="Calibri" w:eastAsia="Calibri" w:hAnsi="Calibri" w:cs="Calibri"/>
+                <w:b/>
+                <w:bCs/>
+                <w:color w:val="005B8C"/>
+                <w:sz w:val="20"/>
+                <w:szCs w:val="20"/>
+              </w:rPr>
+            </w:pPr>
+            <w:r>
+              <w:rPr>
+                <w:rFonts w:eastAsia="Calibri"/>
+                <w:color w:val="005B8C"/>
+                <w:sz w:val="20"/>
+                <w:szCs w:val="20"/>
+              </w:rPr>
+              <w:t>{{firma_tr}}</w:t>
             </w:r>
           </w:p>
         </w:tc>
@@ -7178,7 +6778,7 @@
                 <w:sz w:val="20"/>
                 <w:szCs w:val="20"/>
               </w:rPr>
-              <w:t>Il Tecnico Rilevatore:</w:t>
+              <w:t>Il Tecnico Istruttore:</w:t>
             </w:r>
           </w:p>
         </w:tc>
@@ -7212,27 +6812,7 @@
                 <w:sz w:val="20"/>
                 <w:szCs w:val="20"/>
               </w:rPr>
-              <w:t>{{</w:t>
-            </w:r>
-            <w:proofErr w:type="spellStart"/>
-            <w:r>
-              <w:rPr>
-                <w:rFonts w:eastAsia="Calibri"/>
-                <w:color w:val="005B8C"/>
-                <w:sz w:val="20"/>
-                <w:szCs w:val="20"/>
-              </w:rPr>
-              <w:t>firma_tr</w:t>
-            </w:r>
-            <w:proofErr w:type="spellEnd"/>
-            <w:r>
-              <w:rPr>
-                <w:rFonts w:eastAsia="Calibri"/>
-                <w:color w:val="005B8C"/>
-                <w:sz w:val="20"/>
-                <w:szCs w:val="20"/>
-              </w:rPr>
-              <w:t>}}</w:t>
+              <w:t>{{firma_ti}}</w:t>
             </w:r>
           </w:p>
         </w:tc>
@@ -7281,7 +6861,7 @@
                 <w:sz w:val="20"/>
                 <w:szCs w:val="20"/>
               </w:rPr>
-              <w:t>Il Tecnico Istruttore:</w:t>
+              <w:t>Il Responsabile del Settore:</w:t>
             </w:r>
           </w:p>
         </w:tc>
@@ -7315,27 +6895,7 @@
                 <w:sz w:val="20"/>
                 <w:szCs w:val="20"/>
               </w:rPr>
-              <w:t>{{</w:t>
-            </w:r>
-            <w:proofErr w:type="spellStart"/>
-            <w:r>
-              <w:rPr>
-                <w:rFonts w:eastAsia="Calibri"/>
-                <w:color w:val="005B8C"/>
-                <w:sz w:val="20"/>
-                <w:szCs w:val="20"/>
-              </w:rPr>
-              <w:t>firma_ti</w:t>
-            </w:r>
-            <w:proofErr w:type="spellEnd"/>
-            <w:r>
-              <w:rPr>
-                <w:rFonts w:eastAsia="Calibri"/>
-                <w:color w:val="005B8C"/>
-                <w:sz w:val="20"/>
-                <w:szCs w:val="20"/>
-              </w:rPr>
-              <w:t>}}</w:t>
+              <w:t>{{firma_rz}}</w:t>
             </w:r>
           </w:p>
         </w:tc>
@@ -7384,7 +6944,7 @@
                 <w:sz w:val="20"/>
                 <w:szCs w:val="20"/>
               </w:rPr>
-              <w:t>Il Responsabile del Settore:</w:t>
+              <w:t>Il Responsabile Istruttore:</w:t>
             </w:r>
           </w:p>
         </w:tc>
@@ -7418,130 +6978,7 @@
                 <w:sz w:val="20"/>
                 <w:szCs w:val="20"/>
               </w:rPr>
-              <w:t>{{</w:t>
-            </w:r>
-            <w:proofErr w:type="spellStart"/>
-            <w:r>
-              <w:rPr>
-                <w:rFonts w:eastAsia="Calibri"/>
-                <w:color w:val="005B8C"/>
-                <w:sz w:val="20"/>
-                <w:szCs w:val="20"/>
-              </w:rPr>
-              <w:t>firma_rz</w:t>
-            </w:r>
-            <w:proofErr w:type="spellEnd"/>
-            <w:r>
-              <w:rPr>
-                <w:rFonts w:eastAsia="Calibri"/>
-                <w:color w:val="005B8C"/>
-                <w:sz w:val="20"/>
-                <w:szCs w:val="20"/>
-              </w:rPr>
-              <w:t>}}</w:t>
-            </w:r>
-          </w:p>
-        </w:tc>
-      </w:tr>
-      <w:tr>
-        <w:trPr>
-          <w:trHeight w:hRule="exact" w:val="340"/>
-          <w:jc w:val="center"/>
-        </w:trPr>
-        <w:tc>
-          <w:tcPr>
-            <w:tcW w:w="2688" w:type="dxa"/>
-            <w:gridSpan w:val="2"/>
-            <w:tcBorders>
-              <w:top w:val="single" w:sz="4" w:space="0" w:color="ADADAD" w:themeColor="background2" w:themeShade="BF"/>
-              <w:left w:val="single" w:sz="4" w:space="0" w:color="ADADAD" w:themeColor="background2" w:themeShade="BF"/>
-              <w:bottom w:val="single" w:sz="4" w:space="0" w:color="ADADAD" w:themeColor="background2" w:themeShade="BF"/>
-              <w:right w:val="single" w:sz="4" w:space="0" w:color="ADADAD" w:themeColor="background2" w:themeShade="BF"/>
-            </w:tcBorders>
-            <w:noWrap/>
-            <w:tcMar>
-              <w:top w:w="80" w:type="dxa"/>
-              <w:left w:w="120" w:type="dxa"/>
-              <w:bottom w:w="80" w:type="dxa"/>
-              <w:right w:w="120" w:type="dxa"/>
-            </w:tcMar>
-            <w:vAlign w:val="center"/>
-          </w:tcPr>
-          <w:p>
-            <w:pPr>
-              <w:rPr>
-                <w:rFonts w:ascii="Calibri" w:eastAsia="Calibri" w:hAnsi="Calibri" w:cs="Calibri"/>
-                <w:b/>
-                <w:bCs/>
-                <w:color w:val="005B8C"/>
-                <w:sz w:val="20"/>
-                <w:szCs w:val="20"/>
-              </w:rPr>
-            </w:pPr>
-            <w:r>
-              <w:rPr>
-                <w:rFonts w:ascii="Calibri" w:eastAsia="Calibri" w:hAnsi="Calibri" w:cs="Calibri"/>
-                <w:b/>
-                <w:bCs/>
-                <w:color w:val="005B8C"/>
-                <w:sz w:val="20"/>
-                <w:szCs w:val="20"/>
-              </w:rPr>
-              <w:t>Il Responsabile Istruttore:</w:t>
-            </w:r>
-          </w:p>
-        </w:tc>
-        <w:tc>
-          <w:tcPr>
-            <w:tcW w:w="6722" w:type="dxa"/>
-            <w:gridSpan w:val="7"/>
-            <w:tcBorders>
-              <w:top w:val="single" w:sz="4" w:space="0" w:color="ADADAD" w:themeColor="background2" w:themeShade="BF"/>
-              <w:left w:val="single" w:sz="4" w:space="0" w:color="ADADAD" w:themeColor="background2" w:themeShade="BF"/>
-              <w:bottom w:val="single" w:sz="4" w:space="0" w:color="ADADAD" w:themeColor="background2" w:themeShade="BF"/>
-              <w:right w:val="single" w:sz="4" w:space="0" w:color="ADADAD" w:themeColor="background2" w:themeShade="BF"/>
-            </w:tcBorders>
-            <w:vAlign w:val="center"/>
-          </w:tcPr>
-          <w:p>
-            <w:pPr>
-              <w:rPr>
-                <w:rFonts w:ascii="Calibri" w:eastAsia="Calibri" w:hAnsi="Calibri" w:cs="Calibri"/>
-                <w:b/>
-                <w:bCs/>
-                <w:color w:val="005B8C"/>
-                <w:sz w:val="20"/>
-                <w:szCs w:val="20"/>
-              </w:rPr>
-            </w:pPr>
-            <w:r>
-              <w:rPr>
-                <w:rFonts w:eastAsia="Calibri"/>
-                <w:color w:val="005B8C"/>
-                <w:sz w:val="20"/>
-                <w:szCs w:val="20"/>
-              </w:rPr>
-              <w:t>{{</w:t>
-            </w:r>
-            <w:proofErr w:type="spellStart"/>
-            <w:r>
-              <w:rPr>
-                <w:rFonts w:eastAsia="Calibri"/>
-                <w:color w:val="005B8C"/>
-                <w:sz w:val="20"/>
-                <w:szCs w:val="20"/>
-              </w:rPr>
-              <w:t>firma_ri</w:t>
-            </w:r>
-            <w:proofErr w:type="spellEnd"/>
-            <w:r>
-              <w:rPr>
-                <w:rFonts w:eastAsia="Calibri"/>
-                <w:color w:val="005B8C"/>
-                <w:sz w:val="20"/>
-                <w:szCs w:val="20"/>
-              </w:rPr>
-              <w:t>}}</w:t>
+              <w:t>{{firma_ri}}</w:t>
             </w:r>
           </w:p>
         </w:tc>
@@ -7722,31 +7159,7 @@
               <w:szCs w:val="10"/>
               <w:lang w:val="en-US" w:eastAsia="en-US"/>
             </w:rPr>
-            <w:t xml:space="preserve">web </w:t>
-          </w:r>
-          <w:proofErr w:type="gramStart"/>
-          <w:r>
-            <w:rPr>
-              <w:rFonts w:ascii="Arial" w:eastAsia="Arial" w:hAnsi="Arial" w:cs="Arial"/>
-              <w:bCs/>
-              <w:color w:val="auto"/>
-              <w:sz w:val="10"/>
-              <w:szCs w:val="10"/>
-              <w:lang w:val="en-US" w:eastAsia="en-US"/>
-            </w:rPr>
-            <w:t>http://www.cbsm.it  email</w:t>
-          </w:r>
-          <w:proofErr w:type="gramEnd"/>
-          <w:r>
-            <w:rPr>
-              <w:rFonts w:ascii="Arial" w:eastAsia="Arial" w:hAnsi="Arial" w:cs="Arial"/>
-              <w:bCs/>
-              <w:color w:val="auto"/>
-              <w:sz w:val="10"/>
-              <w:szCs w:val="10"/>
-              <w:lang w:val="en-US" w:eastAsia="en-US"/>
-            </w:rPr>
-            <w:t xml:space="preserve"> </w:t>
+            <w:t xml:space="preserve">web http://www.cbsm.it  email </w:t>
           </w:r>
           <w:hyperlink r:id="rId1" w:history="1">
             <w:r>

</xml_diff>